<commit_message>
Updated Codes and Word documents for respective lectures.
</commit_message>
<xml_diff>
--- a/TYBCA/Java/Java programming.docx
+++ b/TYBCA/Java/Java programming.docx
@@ -9204,6 +9204,7 @@
         <w:rPr>
           <w:b/>
           <w:bCs/>
+          <w:noProof/>
         </w:rPr>
         <w:drawing>
           <wp:inline distT="0" distB="0" distL="0" distR="0" wp14:anchorId="40BB4274" wp14:editId="6AF13694">
@@ -9616,6 +9617,7 @@
         <w:rPr>
           <w:b/>
           <w:bCs/>
+          <w:noProof/>
         </w:rPr>
         <w:drawing>
           <wp:inline distT="0" distB="0" distL="0" distR="0" wp14:anchorId="04241C3E" wp14:editId="785C2859">
@@ -9985,7 +9987,15 @@
         <w:t xml:space="preserve">: - </w:t>
       </w:r>
       <w:r>
-        <w:t>Are one of the most fundamental data structures, that allows us to store multiple values of the same data type in a single variable. They are use for storing and managing collection of data</w:t>
+        <w:t xml:space="preserve">Are one of the most fundamental data structures, that allows us to store multiple values of the same data type in a single variable. They are </w:t>
+      </w:r>
+      <w:proofErr w:type="spellStart"/>
+      <w:r>
+        <w:t>use</w:t>
+      </w:r>
+      <w:proofErr w:type="spellEnd"/>
+      <w:r>
+        <w:t xml:space="preserve"> for storing and managing collection of data</w:t>
       </w:r>
       <w:r>
         <w:t xml:space="preserve"> </w:t>
@@ -10228,9 +10238,400 @@
       <w:r>
         <w:t>}</w:t>
       </w:r>
+    </w:p>
+    <w:p/>
+    <w:p>
+      <w:r>
+        <w:t xml:space="preserve">Types of arrays in </w:t>
+      </w:r>
+      <w:proofErr w:type="gramStart"/>
+      <w:r>
+        <w:t>java :</w:t>
+      </w:r>
+      <w:proofErr w:type="gramEnd"/>
+    </w:p>
+    <w:p>
+      <w:r>
+        <w:t>1d array</w:t>
+      </w:r>
+    </w:p>
+    <w:p>
+      <w:r>
+        <w:t>2d array</w:t>
+      </w:r>
+    </w:p>
+    <w:p>
+      <w:r>
+        <w:t>Multi-d array</w:t>
+      </w:r>
+    </w:p>
+    <w:p>
+      <w:pPr>
+        <w:rPr>
+          <w:b/>
+          <w:bCs/>
+        </w:rPr>
+      </w:pPr>
+      <w:r>
+        <w:rPr>
+          <w:b/>
+          <w:bCs/>
+        </w:rPr>
+        <w:lastRenderedPageBreak/>
+        <w:t xml:space="preserve">Q. Write a java program which </w:t>
+      </w:r>
+      <w:r>
+        <w:rPr>
+          <w:b/>
+          <w:bCs/>
+        </w:rPr>
+        <w:t>declares array</w:t>
+      </w:r>
+      <w:r>
+        <w:rPr>
+          <w:b/>
+          <w:bCs/>
+        </w:rPr>
+        <w:t xml:space="preserve"> of 5 int and display the sum of elements of an array </w:t>
+      </w:r>
+      <w:r>
+        <w:rPr>
+          <w:b/>
+          <w:bCs/>
+        </w:rPr>
+        <w:t xml:space="preserve"> </w:t>
+      </w:r>
+    </w:p>
+    <w:p>
+      <w:pPr>
+        <w:rPr>
+          <w:b/>
+          <w:bCs/>
+        </w:rPr>
+      </w:pPr>
+    </w:p>
+    <w:p>
+      <w:pPr>
+        <w:rPr>
+          <w:b/>
+          <w:bCs/>
+        </w:rPr>
+      </w:pPr>
+      <w:r>
+        <w:rPr>
+          <w:b/>
+          <w:bCs/>
+        </w:rPr>
+        <w:t xml:space="preserve">Code: - </w:t>
+      </w:r>
+    </w:p>
+    <w:p>
+      <w:r>
+        <w:t xml:space="preserve">public class </w:t>
+      </w:r>
+      <w:proofErr w:type="spellStart"/>
+      <w:r>
+        <w:t>arraysumm</w:t>
+      </w:r>
+      <w:proofErr w:type="spellEnd"/>
+    </w:p>
+    <w:p>
+      <w:r>
+        <w:t>{</w:t>
+      </w:r>
+    </w:p>
+    <w:p>
+      <w:r>
+        <w:t xml:space="preserve">    public static void </w:t>
+      </w:r>
+      <w:proofErr w:type="gramStart"/>
+      <w:r>
+        <w:t>main(</w:t>
+      </w:r>
+      <w:proofErr w:type="gramEnd"/>
+      <w:r>
+        <w:t xml:space="preserve">String </w:t>
+      </w:r>
+      <w:proofErr w:type="spellStart"/>
+      <w:proofErr w:type="gramStart"/>
+      <w:r>
+        <w:t>args</w:t>
+      </w:r>
+      <w:proofErr w:type="spellEnd"/>
+      <w:r>
+        <w:t>[</w:t>
+      </w:r>
+      <w:proofErr w:type="gramEnd"/>
+      <w:r>
+        <w:t>])</w:t>
+      </w:r>
+    </w:p>
+    <w:p>
+      <w:r>
+        <w:t>    {</w:t>
+      </w:r>
+    </w:p>
+    <w:p>
+      <w:r>
+        <w:t xml:space="preserve">        </w:t>
+      </w:r>
+      <w:proofErr w:type="gramStart"/>
+      <w:r>
+        <w:t>int[</w:t>
+      </w:r>
+      <w:proofErr w:type="gramEnd"/>
+      <w:r>
+        <w:t xml:space="preserve">] </w:t>
+      </w:r>
+      <w:proofErr w:type="spellStart"/>
+      <w:r>
+        <w:t>arr</w:t>
+      </w:r>
+      <w:proofErr w:type="spellEnd"/>
+      <w:r>
+        <w:t xml:space="preserve"> = {1,2,3,4,5};</w:t>
+      </w:r>
+    </w:p>
+    <w:p>
+      <w:r>
+        <w:t>        int sum = 0;</w:t>
+      </w:r>
+    </w:p>
+    <w:p>
+      <w:r>
+        <w:t xml:space="preserve">        for (int </w:t>
+      </w:r>
+      <w:proofErr w:type="spellStart"/>
+      <w:r>
+        <w:t>i</w:t>
+      </w:r>
+      <w:proofErr w:type="spellEnd"/>
+      <w:r>
+        <w:t xml:space="preserve">=0; </w:t>
+      </w:r>
+      <w:proofErr w:type="spellStart"/>
+      <w:r>
+        <w:t>i</w:t>
+      </w:r>
+      <w:proofErr w:type="spellEnd"/>
+      <w:r>
+        <w:t xml:space="preserve"> &lt; </w:t>
+      </w:r>
+      <w:proofErr w:type="spellStart"/>
+      <w:proofErr w:type="gramStart"/>
+      <w:r>
+        <w:t>arr.length</w:t>
+      </w:r>
+      <w:proofErr w:type="spellEnd"/>
+      <w:proofErr w:type="gramEnd"/>
+      <w:r>
+        <w:t xml:space="preserve">; </w:t>
+      </w:r>
+      <w:proofErr w:type="spellStart"/>
+      <w:r>
+        <w:t>i</w:t>
+      </w:r>
+      <w:proofErr w:type="spellEnd"/>
+      <w:r>
+        <w:t>++)</w:t>
+      </w:r>
+    </w:p>
+    <w:p>
+      <w:r>
+        <w:t>        {</w:t>
+      </w:r>
+    </w:p>
+    <w:p>
+      <w:r>
+        <w:t xml:space="preserve">            sum = sum + </w:t>
+      </w:r>
+      <w:proofErr w:type="spellStart"/>
+      <w:r>
+        <w:t>arr</w:t>
+      </w:r>
+      <w:proofErr w:type="spellEnd"/>
+      <w:r>
+        <w:t>[</w:t>
+      </w:r>
+      <w:proofErr w:type="spellStart"/>
+      <w:r>
+        <w:t>i</w:t>
+      </w:r>
+      <w:proofErr w:type="spellEnd"/>
+      <w:r>
+        <w:t>];</w:t>
+      </w:r>
+    </w:p>
+    <w:p>
+      <w:r>
+        <w:t>        }</w:t>
+      </w:r>
+    </w:p>
+    <w:p>
+      <w:r>
+        <w:t xml:space="preserve">        </w:t>
+      </w:r>
+      <w:proofErr w:type="spellStart"/>
+      <w:r>
+        <w:t>System.out.println</w:t>
+      </w:r>
+      <w:proofErr w:type="spellEnd"/>
+      <w:r>
+        <w:t xml:space="preserve">("sum of </w:t>
+      </w:r>
+      <w:proofErr w:type="spellStart"/>
+      <w:r>
+        <w:t>ele</w:t>
+      </w:r>
+      <w:proofErr w:type="spellEnd"/>
+      <w:r>
+        <w:t xml:space="preserve"> is: " + sum);</w:t>
+      </w:r>
+    </w:p>
+    <w:p>
+      <w:r>
+        <w:t>    }</w:t>
+      </w:r>
+    </w:p>
+    <w:p/>
+    <w:p>
+      <w:r>
+        <w:t>}</w:t>
+      </w:r>
+    </w:p>
+    <w:p/>
+    <w:p>
+      <w:pPr>
+        <w:rPr>
+          <w:b/>
+          <w:bCs/>
+        </w:rPr>
+      </w:pPr>
+      <w:r>
+        <w:rPr>
+          <w:b/>
+          <w:bCs/>
+        </w:rPr>
+        <w:t xml:space="preserve">Output: - </w:t>
+      </w:r>
+    </w:p>
+    <w:p>
+      <w:pPr>
+        <w:rPr>
+          <w:b/>
+          <w:bCs/>
+        </w:rPr>
+      </w:pPr>
+      <w:r>
+        <w:rPr>
+          <w:b/>
+          <w:bCs/>
+          <w:noProof/>
+        </w:rPr>
+        <w:drawing>
+          <wp:inline distT="0" distB="0" distL="0" distR="0" wp14:anchorId="539CEAC0" wp14:editId="74C00D69">
+            <wp:extent cx="5943600" cy="402590"/>
+            <wp:effectExtent l="0" t="0" r="0" b="0"/>
+            <wp:docPr id="2455088" name="Picture 1"/>
+            <wp:cNvGraphicFramePr>
+              <a:graphicFrameLocks xmlns:a="http://schemas.openxmlformats.org/drawingml/2006/main" noChangeAspect="1"/>
+            </wp:cNvGraphicFramePr>
+            <a:graphic xmlns:a="http://schemas.openxmlformats.org/drawingml/2006/main">
+              <a:graphicData uri="http://schemas.openxmlformats.org/drawingml/2006/picture">
+                <pic:pic xmlns:pic="http://schemas.openxmlformats.org/drawingml/2006/picture">
+                  <pic:nvPicPr>
+                    <pic:cNvPr id="2455088" name=""/>
+                    <pic:cNvPicPr/>
+                  </pic:nvPicPr>
+                  <pic:blipFill>
+                    <a:blip r:embed="rId15"/>
+                    <a:stretch>
+                      <a:fillRect/>
+                    </a:stretch>
+                  </pic:blipFill>
+                  <pic:spPr>
+                    <a:xfrm>
+                      <a:off x="0" y="0"/>
+                      <a:ext cx="5943600" cy="402590"/>
+                    </a:xfrm>
+                    <a:prstGeom prst="rect">
+                      <a:avLst/>
+                    </a:prstGeom>
+                  </pic:spPr>
+                </pic:pic>
+              </a:graphicData>
+            </a:graphic>
+          </wp:inline>
+        </w:drawing>
+      </w:r>
+    </w:p>
+    <w:p>
+      <w:pPr>
+        <w:rPr>
+          <w:b/>
+          <w:bCs/>
+        </w:rPr>
+      </w:pPr>
     </w:p>
     <w:p/>
     <w:p/>
+    <w:p/>
+    <w:p/>
+    <w:p>
+      <w:pPr>
+        <w:rPr>
+          <w:b/>
+          <w:bCs/>
+        </w:rPr>
+      </w:pPr>
+      <w:r>
+        <w:rPr>
+          <w:b/>
+          <w:bCs/>
+        </w:rPr>
+        <w:lastRenderedPageBreak/>
+        <w:t>Q. Declare array of 5 int and display the numbers in reverse order</w:t>
+      </w:r>
+    </w:p>
+    <w:p>
+      <w:pPr>
+        <w:rPr>
+          <w:b/>
+          <w:bCs/>
+        </w:rPr>
+      </w:pPr>
+    </w:p>
+    <w:p>
+      <w:pPr>
+        <w:rPr>
+          <w:b/>
+          <w:bCs/>
+        </w:rPr>
+      </w:pPr>
+    </w:p>
+    <w:p>
+      <w:pPr>
+        <w:rPr>
+          <w:b/>
+          <w:bCs/>
+        </w:rPr>
+      </w:pPr>
+      <w:r>
+        <w:rPr>
+          <w:b/>
+          <w:bCs/>
+        </w:rPr>
+        <w:t>Lecture 6: - 31/07/2026</w:t>
+      </w:r>
+    </w:p>
+    <w:p>
+      <w:pPr>
+        <w:rPr>
+          <w:b/>
+          <w:bCs/>
+        </w:rPr>
+      </w:pPr>
+    </w:p>
     <w:sectPr>
       <w:pgSz w:w="12240" w:h="15840"/>
       <w:pgMar w:top="1440" w:right="1440" w:bottom="1440" w:left="1440" w:header="720" w:footer="720" w:gutter="0"/>
@@ -12118,6 +12519,7 @@
   <w:style w:type="character" w:default="1" w:styleId="DefaultParagraphFont">
     <w:name w:val="Default Paragraph Font"/>
     <w:uiPriority w:val="1"/>
+    <w:semiHidden/>
     <w:unhideWhenUsed/>
   </w:style>
   <w:style w:type="table" w:default="1" w:styleId="TableNormal">

</xml_diff>